<commit_message>
fix: improve boss animations and dash distance
</commit_message>
<xml_diff>
--- a/Docs/BAO_CAO_SUA_LOI_ENEMY_BOSS_2026-10-09.docx
+++ b/Docs/BAO_CAO_SUA_LOI_ENEMY_BOSS_2026-10-09.docx
@@ -2543,6 +2543,163 @@
         <w:t>Nguồn art bổ sung: Explosion và Fire là bản sao từ Assets/Imports/Tiny Swords (Update 010) đã có trong project. Có tham khảo sprite Bat và Mage CC0 trên OpenGameArt (opengameart.org/content/bat-32x32; opengameart.org/content/mage-sprites-idle-and-walking) nhưng không nhập vì khác tạo hình hiện tại.</w:t>
       </w:r>
     </w:p>
+    <w:p>
+      <w:pPr>
+        <w:pStyle w:val="Heading1"/>
+      </w:pPr>
+      <w:r>
+        <w:t xml:space="preserve">Bổ sung hoạt ảnh quái và chiến đấu ngày 19 tháng 10 năm 2026</w:t>
+      </w:r>
+    </w:p>
+    <w:p>
+      <w:r>
+        <w:t xml:space="preserve">Lượt cập nhật này thay ảnh tĩnh của quái đặc biệt và boss bằng sprite sheet nhiều khung, tăng kích thước quái đặc biệt thường lên 1,5 lần, làm rõ báo hiệu ra đòn, thêm các đợt đạn boss nhiều kiểu và tăng quãng lướt Shift từ 3 lên 4,5 đơn vị. Warrior và hai prefab boss Bone Sentinel, Skeleton King không bị tăng scale.</w:t>
+      </w:r>
+    </w:p>
+    <w:p>
+      <w:pPr>
+        <w:pStyle w:val="Heading2"/>
+      </w:pPr>
+      <w:r>
+        <w:t xml:space="preserve">Sprite sheet và hoạt ảnh trong game</w:t>
+      </w:r>
+    </w:p>
+    <w:p>
+      <w:r>
+        <w:t xml:space="preserve">EnemyRuntimeSpriteAnimation cắt frame từ sprite sheet ở runtime và thay sprite hiển thị theo trạng thái đứng, di chuyển, tấn công, bị đánh và chết khi asset có các frame tương ứng. NavMeshAgent vẫn điều khiển vị trí gốc và collider; hình ảnh được cập nhật trên SpriteRenderer. Boss3DVisual đồng bộ sprite đang chạy sang renderer hiển thị của boss để hoạt ảnh không bị mất sau lớp hiển thị 3D.</w:t>
+      </w:r>
+    </w:p>
+    <w:p>
+      <w:pPr>
+        <w:pStyle w:val="ListBullet"/>
+      </w:pPr>
+      <w:r>
+        <w:t xml:space="preserve">Bat dùng chu kỳ bay 9 frame; Dark Mage, Elite và Skull lần lượt dùng các sheet Witch, Zombie và Skeleton có chu kỳ idle, di chuyển, đánh, trúng đòn và chết.</w:t>
+      </w:r>
+    </w:p>
+    <w:p>
+      <w:pPr>
+        <w:pStyle w:val="ListBullet"/>
+      </w:pPr>
+      <w:r>
+        <w:t xml:space="preserve">Poison Slime giữ sprite xanh lục PoisonSlimeReadable.png sẵn có; không dùng sheet xanh cyan mới. Khi không có atlas animation, EnemyLocomotionVisual vẫn tạo nhịp nảy và thở trên đúng hình xanh cũ.</w:t>
+      </w:r>
+    </w:p>
+    <w:p>
+      <w:pPr>
+        <w:pStyle w:val="ListBullet"/>
+      </w:pPr>
+      <w:r>
+        <w:t xml:space="preserve">Boss Skeleton King và Bone Sentinel dùng sheet Undead King nhiều frame. Boss mini và boss cuối đều được gắn bộ điều khiển đợt tấn công; hiệu ứng này áp dụng cho prefab boss được chọn ở level 10.</w:t>
+      </w:r>
+    </w:p>
+    <w:p>
+      <w:r>
+        <w:t xml:space="preserve">Nguồn, giấy phép và ghi công được ghi trong Assets/Resources/Enemy/AnimatedArt/SOURCE.md. Các sheet CC0 được dùng theo giấy phép CC0; Skeleton Archer được ghi công Wolfgang Wozniak (Ouren), CC BY 3.0; Vampire được ghi công CraftPix, OGA-BY 3.0. Không dùng asset trả phí.</w:t>
+      </w:r>
+    </w:p>
+    <w:p>
+      <w:pPr>
+        <w:pStyle w:val="Heading2"/>
+      </w:pPr>
+      <w:r>
+        <w:t xml:space="preserve">Kích thước quái đặc biệt</w:t>
+      </w:r>
+    </w:p>
+    <w:p>
+      <w:r>
+        <w:t xml:space="preserve">Scale X/Y của Bat, Dark Mage, Elite Enemy, Skeleton Archer, Poison Slime, Skull, Vampire, Goblin Torch, Goblin TNT và Goblin Barrel được nhân 1,5 theo scale hiển thị đang có trong prefab. Trục Z được giữ theo prefab. Warrior, Bone Sentinel và Skeleton King được loại khỏi thay đổi này.</w:t>
+      </w:r>
+    </w:p>
+    <w:p>
+      <w:pPr>
+        <w:pStyle w:val="Heading2"/>
+      </w:pPr>
+      <w:r>
+        <w:t xml:space="preserve">Báo hiệu đòn đánh và nhịp boss</w:t>
+      </w:r>
+    </w:p>
+    <w:p>
+      <w:r>
+        <w:t xml:space="preserve">EnemyCombat tạo vòng báo hiệu dưới mục tiêu trong thời gian windup; màu thay theo nhóm quái, và màu đỏ được dùng cho boss. Đòn đặc biệt của MiniBossController cũng hiện vòng báo hiệu, kích hoạt frame tấn công và hiệu ứng sáng trước khi phóng loạt ba mảnh đạn.</w:t>
+      </w:r>
+    </w:p>
+    <w:p>
+      <w:r>
+        <w:t xml:space="preserve">BossWaveAttackController chạy luân phiên ba mẫu: quạt đạn nhiều hướng, vòng đạn tỏa tròn và ba loạt đạn chụm bám theo vị trí người chơi. Trước mỗi đợt, boss dừng lại, hiện cue màu, phát VFX rồi mới bắn. Đạn mặc định nhận màu riêng theo từng mẫu. Với final boss dùng EnemyCombat, cooldown đòn thường còn khoảng 72% thông số prefab (giới hạn 1,15 đến 2,4 giây), windup còn khoảng 75% (giới hạn 0,35 đến 0,58 giây). Skeleton King áp dụng cùng hệ số cho bản sao cấu hình phase riêng của mỗi lượt chơi. Đợt đặc biệt boss chạy mỗi 4,6 giây. Ở Bone Sentinel level 5 và 9, cooldown và windup đòn thường cũng được giảm trên cấu hình runtime; cooldown đòn đặc biệt giảm còn khoảng 72% và được chặn trong khoảng 2,8 đến 4,5 giây.</w:t>
+      </w:r>
+    </w:p>
+    <w:p>
+      <w:pPr>
+        <w:pStyle w:val="Heading2"/>
+      </w:pPr>
+      <w:r>
+        <w:t xml:space="preserve">Lướt Shift</w:t>
+      </w:r>
+    </w:p>
+    <w:p>
+      <w:r>
+        <w:t xml:space="preserve">PlayerMovement.dashDistance đổi từ 3,0 sang 4,5 đơn vị, tăng quãng lướt mỗi lần dùng Shift đúng 1,5 lần. Thời gian dash và điều kiện hồi chiêu giữ nguyên.</w:t>
+      </w:r>
+    </w:p>
+    <w:p>
+      <w:pPr>
+        <w:pStyle w:val="Heading2"/>
+      </w:pPr>
+      <w:r>
+        <w:t xml:space="preserve">Kiểm tra còn cần thực hiện</w:t>
+      </w:r>
+    </w:p>
+    <w:p>
+      <w:r>
+        <w:t xml:space="preserve">Lượt cập nhật này chưa chạy Unity compile, batch validation hoặc Play Mode. Vì vậy, chưa xác nhận trực quan tốc độ khung hình, độ vừa của collider sau khi tăng scale, cách boss chọn khoảng cách trong phòng, và cách các sheet hiển thị trên màn hình thật. Cần mở Unity để quan sát từng nhóm quái, thử né đủ ba mẫu boss, kiểm tra đòn mini-boss và đo quãng Shift trong game trước khi chốt bản phát hành.</w:t>
+      </w:r>
+    </w:p>
+    <w:p>
+      <w:pPr>
+        <w:pStyle w:val="Heading2"/>
+      </w:pPr>
+      <w:r>
+        <w:t xml:space="preserve">Điều chỉnh theo ảnh kiểm thử ngày 19 tháng 10 năm 2026</w:t>
+      </w:r>
+    </w:p>
+    <w:p>
+      <w:r>
+        <w:t xml:space="preserve">Ảnh Unity cho thấy quãng dash còn 3 đơn vị do các scene lưu giá trị dashDistance riêng, ghi đè giá trị mặc định trong PlayerMovement. Đã đổi 11 giá trị serialize từ 3 lên 4,5 trong Dungeon và các scene level.</w:t>
+      </w:r>
+    </w:p>
+    <w:p>
+      <w:pPr>
+        <w:pStyle w:val="ListBullet"/>
+      </w:pPr>
+      <w:r>
+        <w:t xml:space="preserve">EnemyRuntimeSpriteAnimation.GetFrames đọc nhầm mảng cho atlas nằm ngang; phần khởi tạo truy cập Length trên mảng null và phát NullReferenceException. Đã nối GetFrames tới horizontalFrames, thêm kiểm tra null trước khi chọn frame, để các sprite sheet quái và boss thực sự chạy.</w:t>
+      </w:r>
+    </w:p>
+    <w:p>
+      <w:pPr>
+        <w:pStyle w:val="ListBullet"/>
+      </w:pPr>
+      <w:r>
+        <w:t xml:space="preserve">Level 10 trước đây lấy boss ngẫu nhiên từ danh sách có cả Slime, Bat và quái thường. Nay PlaceLevelBoss dùng bossPrefab đã gán trong scene, Skeleton King, như thiết kế arena cuối; level 5 và 9 vẫn dùng Bone Sentinel.</w:t>
+      </w:r>
+    </w:p>
+    <w:p>
+      <w:pPr>
+        <w:pStyle w:val="ListBullet"/>
+      </w:pPr>
+      <w:r>
+        <w:t xml:space="preserve">Giới hạn kích thước hiển thị boss cuối còn tối đa khoảng 4,2 đơn vị trước khi tìm vị trí phù hợp trong arena, tránh boss phóng lớn và che gần hết màn hình. Skeleton King dùng hoạt ảnh đi bộ, không còn chuyển động lơ lửng.</w:t>
+      </w:r>
+    </w:p>
+    <w:p>
+      <w:pPr>
+        <w:pStyle w:val="ListBullet"/>
+      </w:pPr>
+      <w:r>
+        <w:t xml:space="preserve">Poison Slime tiếp tục dùng PoisonSlimeReadable.png màu xanh lục và hoạt ảnh nảy hiện có. Sheet xanh cyan được bỏ khỏi Resources để không ghi đè hình cũ.</w:t>
+      </w:r>
+    </w:p>
     <w:sectPr>
       <w:pgSz w:w="12240" w:h="15840"/>
       <w:pgMar w:top="1037" w:right="1123" w:bottom="1037" w:left="1123" w:header="720" w:footer="720" w:gutter="0"/>

</xml_diff>